<commit_message>
adding pictures to manuscript
</commit_message>
<xml_diff>
--- a/document/manuscript.docx
+++ b/document/manuscript.docx
@@ -26,7 +26,7 @@
         <w:t xml:space="preserve">30 September 2026</w:t>
       </w:r>
     </w:p>
-    <w:bookmarkStart w:id="20" w:name="abstract"/>
+    <w:bookmarkStart w:id="9" w:name="abstract"/>
     <w:p>
       <w:pPr>
         <w:pStyle w:val="Heading1"/>
@@ -35,8 +35,8 @@
         <w:t xml:space="preserve">Abstract</w:t>
       </w:r>
     </w:p>
-    <w:bookmarkEnd w:id="20"/>
-    <w:bookmarkStart w:id="22" w:name="kernel"/>
+    <w:bookmarkEnd w:id="9"/>
+    <w:bookmarkStart w:id="10" w:name="kernel"/>
     <w:p>
       <w:pPr>
         <w:pStyle w:val="Heading1"/>
@@ -61,71 +61,838 @@
         <w:t xml:space="preserve">The main aim of this work would be to develop a machine learning algorithm for calibrating a high-dimensional copula with tail dependence different from Gaussian, while still reflecting the observed history with regards to selected measures (i.e., matching correlation matrix, matching pairwise tail dependence at the specific percentile, etc.). The latter is expected to require the creation of a custom loss function to achieve minimization with regards to those measures. On the simulation part, a range of different approaches can be considered, starting from semi-analytical methods to Variational Autoencoders (VAEs) and Generative Adversarial Networks (GANs).</w:t>
       </w:r>
     </w:p>
+    <w:bookmarkEnd w:id="10"/>
+    <w:bookmarkStart w:id="28" w:name="theory"/>
+    <w:p>
+      <w:pPr>
+        <w:pStyle w:val="Heading1"/>
+      </w:pPr>
+      <w:r>
+        <w:t xml:space="preserve">… theory</w:t>
+      </w:r>
+    </w:p>
+    <w:bookmarkStart w:id="11" w:name="copulas"/>
+    <w:p>
+      <w:pPr>
+        <w:pStyle w:val="Heading2"/>
+      </w:pPr>
+      <w:r>
+        <w:t xml:space="preserve">Copulas</w:t>
+      </w:r>
+    </w:p>
+    <w:p>
+      <w:pPr>
+        <w:pStyle w:val="FirstParagraph"/>
+      </w:pPr>
+      <m:oMath>
+        <m:r>
+          <m:t>C</m:t>
+        </m:r>
+        <m:r>
+          <m:rPr>
+            <m:sty m:val="p"/>
+          </m:rPr>
+          <m:t>:</m:t>
+        </m:r>
+        <m:r>
+          <m:rPr>
+            <m:sty m:val="p"/>
+          </m:rPr>
+          <m:t>[</m:t>
+        </m:r>
+        <m:r>
+          <m:t>0</m:t>
+        </m:r>
+        <m:r>
+          <m:rPr>
+            <m:sty m:val="p"/>
+          </m:rPr>
+          <m:t>,</m:t>
+        </m:r>
+        <m:r>
+          <m:t>1</m:t>
+        </m:r>
+        <m:sSup>
+          <m:e>
+            <m:r>
+              <m:rPr>
+                <m:sty m:val="p"/>
+              </m:rPr>
+              <m:t>]</m:t>
+            </m:r>
+          </m:e>
+          <m:sup>
+            <m:r>
+              <m:t>d</m:t>
+            </m:r>
+          </m:sup>
+        </m:sSup>
+        <m:r>
+          <m:rPr>
+            <m:sty m:val="p"/>
+          </m:rPr>
+          <m:t>−</m:t>
+        </m:r>
+        <m:r>
+          <m:rPr>
+            <m:sty m:val="p"/>
+          </m:rPr>
+          <m:t>&gt;</m:t>
+        </m:r>
+        <m:r>
+          <m:rPr>
+            <m:sty m:val="p"/>
+          </m:rPr>
+          <m:t>[</m:t>
+        </m:r>
+        <m:r>
+          <m:t>0</m:t>
+        </m:r>
+        <m:r>
+          <m:rPr>
+            <m:sty m:val="p"/>
+          </m:rPr>
+          <m:t>,</m:t>
+        </m:r>
+        <m:r>
+          <m:t>1</m:t>
+        </m:r>
+        <m:r>
+          <m:rPr>
+            <m:sty m:val="p"/>
+          </m:rPr>
+          <m:t>]</m:t>
+        </m:r>
+      </m:oMath>
+      <w:r>
+        <w:t xml:space="preserve"> </w:t>
+      </w:r>
+      <w:r>
+        <w:t xml:space="preserve">is a d-dimentional copula if</w:t>
+      </w:r>
+      <w:r>
+        <w:t xml:space="preserve"> </w:t>
+      </w:r>
+      <m:oMath>
+        <m:r>
+          <m:t>C</m:t>
+        </m:r>
+      </m:oMath>
+      <w:r>
+        <w:t xml:space="preserve"> </w:t>
+      </w:r>
+      <w:r>
+        <w:t xml:space="preserve">is a joint cumulative distribution function of a d-dimentional random vector on the unit cube</w:t>
+      </w:r>
+      <w:r>
+        <w:t xml:space="preserve"> </w:t>
+      </w:r>
+      <m:oMath>
+        <m:r>
+          <m:rPr>
+            <m:sty m:val="p"/>
+          </m:rPr>
+          <m:t>[</m:t>
+        </m:r>
+        <m:r>
+          <m:t>0</m:t>
+        </m:r>
+        <m:r>
+          <m:rPr>
+            <m:sty m:val="p"/>
+          </m:rPr>
+          <m:t>,</m:t>
+        </m:r>
+        <m:r>
+          <m:t>1</m:t>
+        </m:r>
+        <m:sSup>
+          <m:e>
+            <m:r>
+              <m:rPr>
+                <m:sty m:val="p"/>
+              </m:rPr>
+              <m:t>]</m:t>
+            </m:r>
+          </m:e>
+          <m:sup>
+            <m:r>
+              <m:t>d</m:t>
+            </m:r>
+          </m:sup>
+        </m:sSup>
+        <m:r>
+          <m:t>w</m:t>
+        </m:r>
+        <m:r>
+          <m:t>i</m:t>
+        </m:r>
+        <m:r>
+          <m:t>t</m:t>
+        </m:r>
+        <m:r>
+          <m:t>h</m:t>
+        </m:r>
+        <m:r>
+          <m:t>u</m:t>
+        </m:r>
+        <m:r>
+          <m:t>n</m:t>
+        </m:r>
+        <m:r>
+          <m:t>i</m:t>
+        </m:r>
+        <m:r>
+          <m:t>f</m:t>
+        </m:r>
+        <m:r>
+          <m:t>o</m:t>
+        </m:r>
+        <m:r>
+          <m:t>r</m:t>
+        </m:r>
+        <m:r>
+          <m:t>m</m:t>
+        </m:r>
+        <m:r>
+          <m:t>m</m:t>
+        </m:r>
+        <m:r>
+          <m:t>a</m:t>
+        </m:r>
+        <m:r>
+          <m:t>r</m:t>
+        </m:r>
+        <m:r>
+          <m:t>g</m:t>
+        </m:r>
+        <m:r>
+          <m:t>i</m:t>
+        </m:r>
+        <m:r>
+          <m:t>n</m:t>
+        </m:r>
+        <m:r>
+          <m:t>a</m:t>
+        </m:r>
+        <m:r>
+          <m:t>l</m:t>
+        </m:r>
+        <m:r>
+          <m:t>s</m:t>
+        </m:r>
+      </m:oMath>
+    </w:p>
+    <w:bookmarkEnd w:id="11"/>
+    <w:bookmarkStart w:id="13" w:name="sklars-theorem"/>
+    <w:p>
+      <w:pPr>
+        <w:pStyle w:val="Heading2"/>
+      </w:pPr>
+      <w:r>
+        <w:t xml:space="preserve">Sklar’s theorem</w:t>
+      </w:r>
+    </w:p>
+    <w:p>
+      <w:pPr>
+        <w:pStyle w:val="FirstParagraph"/>
+      </w:pPr>
+      <w:r>
+        <w:t xml:space="preserve">Every multivariate cumulative distribution function</w:t>
+      </w:r>
+      <w:r>
+        <w:t xml:space="preserve"> </w:t>
+      </w:r>
+      <m:oMath>
+        <m:r>
+          <m:t>H</m:t>
+        </m:r>
+        <m:r>
+          <m:rPr>
+            <m:sty m:val="p"/>
+          </m:rPr>
+          <m:t>(</m:t>
+        </m:r>
+        <m:sSub>
+          <m:e>
+            <m:r>
+              <m:t>x</m:t>
+            </m:r>
+          </m:e>
+          <m:sub>
+            <m:r>
+              <m:t>1</m:t>
+            </m:r>
+          </m:sub>
+        </m:sSub>
+        <m:r>
+          <m:rPr>
+            <m:sty m:val="p"/>
+          </m:rPr>
+          <m:t>,</m:t>
+        </m:r>
+        <m:r>
+          <m:rPr>
+            <m:sty m:val="p"/>
+          </m:rPr>
+          <m:t>.</m:t>
+        </m:r>
+        <m:r>
+          <m:rPr>
+            <m:sty m:val="p"/>
+          </m:rPr>
+          <m:t>.</m:t>
+        </m:r>
+        <m:r>
+          <m:rPr>
+            <m:sty m:val="p"/>
+          </m:rPr>
+          <m:t>.</m:t>
+        </m:r>
+        <m:sSub>
+          <m:e>
+            <m:r>
+              <m:t>x</m:t>
+            </m:r>
+          </m:e>
+          <m:sub>
+            <m:r>
+              <m:t>d</m:t>
+            </m:r>
+          </m:sub>
+        </m:sSub>
+        <m:r>
+          <m:rPr>
+            <m:sty m:val="p"/>
+          </m:rPr>
+          <m:t>)</m:t>
+        </m:r>
+        <m:r>
+          <m:rPr>
+            <m:sty m:val="p"/>
+          </m:rPr>
+          <m:t>=</m:t>
+        </m:r>
+        <m:r>
+          <m:t>P</m:t>
+        </m:r>
+        <m:r>
+          <m:t>r</m:t>
+        </m:r>
+        <m:r>
+          <m:rPr>
+            <m:sty m:val="p"/>
+          </m:rPr>
+          <m:t>[</m:t>
+        </m:r>
+        <m:sSub>
+          <m:e>
+            <m:r>
+              <m:t>X</m:t>
+            </m:r>
+          </m:e>
+          <m:sub>
+            <m:r>
+              <m:t>1</m:t>
+            </m:r>
+          </m:sub>
+        </m:sSub>
+        <m:r>
+          <m:rPr>
+            <m:sty m:val="p"/>
+          </m:rPr>
+          <m:t>≤</m:t>
+        </m:r>
+        <m:sSub>
+          <m:e>
+            <m:r>
+              <m:t>x</m:t>
+            </m:r>
+          </m:e>
+          <m:sub>
+            <m:r>
+              <m:t>1</m:t>
+            </m:r>
+          </m:sub>
+        </m:sSub>
+        <m:r>
+          <m:rPr>
+            <m:sty m:val="p"/>
+          </m:rPr>
+          <m:t>,</m:t>
+        </m:r>
+        <m:r>
+          <m:rPr>
+            <m:sty m:val="p"/>
+          </m:rPr>
+          <m:t>.</m:t>
+        </m:r>
+        <m:r>
+          <m:rPr>
+            <m:sty m:val="p"/>
+          </m:rPr>
+          <m:t>.</m:t>
+        </m:r>
+        <m:r>
+          <m:rPr>
+            <m:sty m:val="p"/>
+          </m:rPr>
+          <m:t>.</m:t>
+        </m:r>
+        <m:sSub>
+          <m:e>
+            <m:r>
+              <m:t>X</m:t>
+            </m:r>
+          </m:e>
+          <m:sub>
+            <m:r>
+              <m:t>d</m:t>
+            </m:r>
+          </m:sub>
+        </m:sSub>
+        <m:r>
+          <m:rPr>
+            <m:sty m:val="p"/>
+          </m:rPr>
+          <m:t>≤</m:t>
+        </m:r>
+        <m:sSub>
+          <m:e>
+            <m:r>
+              <m:t>x</m:t>
+            </m:r>
+          </m:e>
+          <m:sub>
+            <m:r>
+              <m:t>d</m:t>
+            </m:r>
+          </m:sub>
+        </m:sSub>
+        <m:r>
+          <m:rPr>
+            <m:sty m:val="p"/>
+          </m:rPr>
+          <m:t>]</m:t>
+        </m:r>
+      </m:oMath>
+      <w:r>
+        <w:t xml:space="preserve"> </w:t>
+      </w:r>
+      <w:r>
+        <w:t xml:space="preserve">of a random</w:t>
+      </w:r>
+      <w:r>
+        <w:t xml:space="preserve"> </w:t>
+      </w:r>
+      <m:oMath>
+        <m:r>
+          <m:rPr>
+            <m:sty m:val="p"/>
+          </m:rPr>
+          <m:t>(</m:t>
+        </m:r>
+        <m:sSub>
+          <m:e>
+            <m:r>
+              <m:t>X</m:t>
+            </m:r>
+          </m:e>
+          <m:sub>
+            <m:r>
+              <m:t>1</m:t>
+            </m:r>
+          </m:sub>
+        </m:sSub>
+        <m:r>
+          <m:rPr>
+            <m:sty m:val="p"/>
+          </m:rPr>
+          <m:t>,</m:t>
+        </m:r>
+        <m:sSub>
+          <m:e>
+            <m:r>
+              <m:t>X</m:t>
+            </m:r>
+          </m:e>
+          <m:sub>
+            <m:r>
+              <m:t>2</m:t>
+            </m:r>
+          </m:sub>
+        </m:sSub>
+        <m:r>
+          <m:rPr>
+            <m:sty m:val="p"/>
+          </m:rPr>
+          <m:t>,</m:t>
+        </m:r>
+        <m:r>
+          <m:rPr>
+            <m:sty m:val="p"/>
+          </m:rPr>
+          <m:t>.</m:t>
+        </m:r>
+        <m:r>
+          <m:rPr>
+            <m:sty m:val="p"/>
+          </m:rPr>
+          <m:t>.</m:t>
+        </m:r>
+        <m:r>
+          <m:rPr>
+            <m:sty m:val="p"/>
+          </m:rPr>
+          <m:t>.</m:t>
+        </m:r>
+        <m:r>
+          <m:rPr>
+            <m:sty m:val="p"/>
+          </m:rPr>
+          <m:t>,</m:t>
+        </m:r>
+        <m:sSub>
+          <m:e>
+            <m:r>
+              <m:t>X</m:t>
+            </m:r>
+          </m:e>
+          <m:sub>
+            <m:r>
+              <m:t>d</m:t>
+            </m:r>
+          </m:sub>
+        </m:sSub>
+        <m:r>
+          <m:rPr>
+            <m:sty m:val="p"/>
+          </m:rPr>
+          <m:t>)</m:t>
+        </m:r>
+      </m:oMath>
+      <w:r>
+        <w:t xml:space="preserve"> </w:t>
+      </w:r>
+      <w:r>
+        <w:t xml:space="preserve">can be expressed in terms of its marginals</w:t>
+      </w:r>
+      <w:r>
+        <w:t xml:space="preserve"> </w:t>
+      </w:r>
+      <m:oMath>
+        <m:sSub>
+          <m:e>
+            <m:r>
+              <m:t>F</m:t>
+            </m:r>
+          </m:e>
+          <m:sub>
+            <m:r>
+              <m:t>i</m:t>
+            </m:r>
+          </m:sub>
+        </m:sSub>
+        <m:r>
+          <m:rPr>
+            <m:sty m:val="p"/>
+          </m:rPr>
+          <m:t>(</m:t>
+        </m:r>
+        <m:sSub>
+          <m:e>
+            <m:r>
+              <m:t>x</m:t>
+            </m:r>
+          </m:e>
+          <m:sub>
+            <m:r>
+              <m:t>i</m:t>
+            </m:r>
+          </m:sub>
+        </m:sSub>
+        <m:r>
+          <m:rPr>
+            <m:sty m:val="p"/>
+          </m:rPr>
+          <m:t>)</m:t>
+        </m:r>
+        <m:r>
+          <m:rPr>
+            <m:sty m:val="p"/>
+          </m:rPr>
+          <m:t>=</m:t>
+        </m:r>
+        <m:r>
+          <m:t>P</m:t>
+        </m:r>
+        <m:r>
+          <m:t>r</m:t>
+        </m:r>
+        <m:r>
+          <m:rPr>
+            <m:sty m:val="p"/>
+          </m:rPr>
+          <m:t>[</m:t>
+        </m:r>
+        <m:sSub>
+          <m:e>
+            <m:r>
+              <m:t>X</m:t>
+            </m:r>
+          </m:e>
+          <m:sub>
+            <m:r>
+              <m:t>i</m:t>
+            </m:r>
+          </m:sub>
+        </m:sSub>
+        <m:r>
+          <m:rPr>
+            <m:sty m:val="p"/>
+          </m:rPr>
+          <m:t>≤</m:t>
+        </m:r>
+        <m:sSub>
+          <m:e>
+            <m:r>
+              <m:t>x</m:t>
+            </m:r>
+          </m:e>
+          <m:sub>
+            <m:r>
+              <m:t>i</m:t>
+            </m:r>
+          </m:sub>
+        </m:sSub>
+        <m:r>
+          <m:rPr>
+            <m:sty m:val="p"/>
+          </m:rPr>
+          <m:t>]</m:t>
+        </m:r>
+      </m:oMath>
+      <w:r>
+        <w:t xml:space="preserve"> </w:t>
+      </w:r>
+      <w:r>
+        <w:t xml:space="preserve">and a copula</w:t>
+      </w:r>
+      <w:r>
+        <w:t xml:space="preserve"> </w:t>
+      </w:r>
+      <m:oMath>
+        <m:r>
+          <m:t>C</m:t>
+        </m:r>
+      </m:oMath>
+      <w:r>
+        <w:t xml:space="preserve">, as:</w:t>
+      </w:r>
+    </w:p>
     <w:p>
       <w:pPr>
         <w:pStyle w:val="BodyText"/>
       </w:pPr>
-      <w:bookmarkStart w:id="21" w:name="eq1"/>
+      <w:bookmarkStart w:id="12" w:name="eq1"/>
       <m:oMathPara>
         <m:oMathParaPr>
           <m:jc m:val="center"/>
         </m:oMathParaPr>
         <m:oMath>
           <m:r>
-            <m:t>x</m:t>
+            <m:t>H</m:t>
           </m:r>
           <m:r>
             <m:rPr>
               <m:sty m:val="p"/>
             </m:rPr>
-            <m:t>=</m:t>
-          </m:r>
-          <m:sSup>
+            <m:t>(</m:t>
+          </m:r>
+          <m:sSub>
             <m:e>
               <m:r>
-                <m:t>X</m:t>
+                <m:t>x</m:t>
               </m:r>
             </m:e>
-            <m:sup>
+            <m:sub>
               <m:r>
-                <m:t>2</m:t>
+                <m:t>1</m:t>
               </m:r>
-            </m:sup>
-          </m:sSup>
+            </m:sub>
+          </m:sSub>
           <m:r>
             <m:rPr>
               <m:sty m:val="p"/>
             </m:rPr>
-            <m:t>+</m:t>
+            <m:t>,</m:t>
+          </m:r>
+          <m:r>
+            <m:rPr>
+              <m:sty m:val="p"/>
+            </m:rPr>
+            <m:t>.</m:t>
+          </m:r>
+          <m:r>
+            <m:rPr>
+              <m:sty m:val="p"/>
+            </m:rPr>
+            <m:t>.</m:t>
+          </m:r>
+          <m:r>
+            <m:rPr>
+              <m:sty m:val="p"/>
+            </m:rPr>
+            <m:t>.</m:t>
+          </m:r>
+          <m:r>
+            <m:rPr>
+              <m:sty m:val="p"/>
+            </m:rPr>
+            <m:t>,</m:t>
           </m:r>
           <m:sSub>
             <m:e>
               <m:r>
-                <m:t>Y</m:t>
+                <m:t>x</m:t>
               </m:r>
             </m:e>
             <m:sub>
               <m:r>
                 <m:t>d</m:t>
               </m:r>
+            </m:sub>
+          </m:sSub>
+          <m:r>
+            <m:rPr>
+              <m:sty m:val="p"/>
+            </m:rPr>
+            <m:t>)</m:t>
+          </m:r>
+          <m:r>
+            <m:rPr>
+              <m:sty m:val="p"/>
+            </m:rPr>
+            <m:t>=</m:t>
+          </m:r>
+          <m:r>
+            <m:t>C</m:t>
+          </m:r>
+          <m:r>
+            <m:rPr>
+              <m:sty m:val="p"/>
+            </m:rPr>
+            <m:t>(</m:t>
+          </m:r>
+          <m:sSub>
+            <m:e>
               <m:r>
-                <m:t>s</m:t>
+                <m:t>F</m:t>
               </m:r>
+            </m:e>
+            <m:sub>
+              <m:r>
+                <m:t>1</m:t>
+              </m:r>
+            </m:sub>
+          </m:sSub>
+          <m:r>
+            <m:rPr>
+              <m:sty m:val="p"/>
+            </m:rPr>
+            <m:t>(</m:t>
+          </m:r>
+          <m:sSub>
+            <m:e>
+              <m:r>
+                <m:t>x</m:t>
+              </m:r>
+            </m:e>
+            <m:sub>
+              <m:r>
+                <m:t>1</m:t>
+              </m:r>
+            </m:sub>
+          </m:sSub>
+          <m:r>
+            <m:rPr>
+              <m:sty m:val="p"/>
+            </m:rPr>
+            <m:t>)</m:t>
+          </m:r>
+          <m:r>
+            <m:rPr>
+              <m:sty m:val="p"/>
+            </m:rPr>
+            <m:t>,</m:t>
+          </m:r>
+          <m:r>
+            <m:rPr>
+              <m:sty m:val="p"/>
+            </m:rPr>
+            <m:t>.</m:t>
+          </m:r>
+          <m:r>
+            <m:rPr>
+              <m:sty m:val="p"/>
+            </m:rPr>
+            <m:t>.</m:t>
+          </m:r>
+          <m:r>
+            <m:rPr>
+              <m:sty m:val="p"/>
+            </m:rPr>
+            <m:t>.</m:t>
+          </m:r>
+          <m:r>
+            <m:rPr>
+              <m:sty m:val="p"/>
+            </m:rPr>
+            <m:t>,</m:t>
+          </m:r>
+          <m:sSub>
+            <m:e>
+              <m:r>
+                <m:t>F</m:t>
+              </m:r>
+            </m:e>
+            <m:sub>
               <m:r>
                 <m:t>d</m:t>
               </m:r>
+            </m:sub>
+          </m:sSub>
+          <m:r>
+            <m:rPr>
+              <m:sty m:val="p"/>
+            </m:rPr>
+            <m:t>(</m:t>
+          </m:r>
+          <m:sSub>
+            <m:e>
               <m:r>
-                <m:t>s</m:t>
+                <m:t>x</m:t>
               </m:r>
+            </m:e>
+            <m:sub>
               <m:r>
                 <m:t>d</m:t>
               </m:r>
-              <m:r>
-                <m:t>s</m:t>
-              </m:r>
             </m:sub>
           </m:sSub>
           <m:r>
+            <m:rPr>
+              <m:sty m:val="p"/>
+            </m:rPr>
+            <m:t>)</m:t>
+          </m:r>
+          <m:r>
+            <m:rPr>
+              <m:sty m:val="p"/>
+            </m:rPr>
+            <m:t>)</m:t>
+          </m:r>
+          <m:r>
             <m:t> </m:t>
           </m:r>
           <m:r>
@@ -137,31 +904,274 @@
           <m:r>
             <m:t> </m:t>
           </m:r>
-          <m:d>
-            <m:dPr>
-              <m:begChr m:val="("/>
-              <m:sepChr m:val=""/>
-              <m:endChr m:val=")"/>
-              <m:grow/>
-            </m:dPr>
-            <m:e>
-              <m:r>
-                <m:t>E</m:t>
-              </m:r>
-              <m:r>
-                <m:t>q</m:t>
-              </m:r>
-              <m:r>
-                <m:t>.1</m:t>
-              </m:r>
-            </m:e>
-          </m:d>
+          <m:r>
+            <m:rPr>
+              <m:sty m:val="p"/>
+            </m:rPr>
+            <m:t>(</m:t>
+          </m:r>
+          <m:r>
+            <m:t>E</m:t>
+          </m:r>
+          <m:r>
+            <m:t>q</m:t>
+          </m:r>
+          <m:r>
+            <m:t>.1</m:t>
+          </m:r>
+          <m:r>
+            <m:rPr>
+              <m:sty m:val="p"/>
+            </m:rPr>
+            <m:t>)</m:t>
+          </m:r>
         </m:oMath>
       </m:oMathPara>
-      <w:bookmarkEnd w:id="21"/>
-    </w:p>
-    <w:bookmarkEnd w:id="22"/>
-    <w:bookmarkStart w:id="30" w:name="literature"/>
+      <w:bookmarkEnd w:id="12"/>
+    </w:p>
+    <w:bookmarkEnd w:id="13"/>
+    <w:bookmarkStart w:id="20" w:name="gaussian-copula"/>
+    <w:p>
+      <w:pPr>
+        <w:pStyle w:val="Heading2"/>
+      </w:pPr>
+      <w:r>
+        <w:t xml:space="preserve">Gaussian copula</w:t>
+      </w:r>
+    </w:p>
+    <w:p>
+      <w:pPr>
+        <w:pStyle w:val="CaptionedFigure"/>
+      </w:pPr>
+      <w:r>
+        <w:drawing>
+          <wp:inline>
+            <wp:extent cx="5334000" cy="4000499"/>
+            <wp:effectExtent b="0" l="0" r="0" t="0"/>
+            <wp:docPr descr="Figure 1: Uniform scenarios Gaussian_copula, numerical simulation" title="" id="15" name="Picture"/>
+            <a:graphic>
+              <a:graphicData uri="http://schemas.openxmlformats.org/drawingml/2006/picture">
+                <pic:pic>
+                  <pic:nvPicPr>
+                    <pic:cNvPr descr="figures\Uniform_scenarios_Gaussian_copula,_numerical_simulation.png" id="16" name="Picture"/>
+                    <pic:cNvPicPr>
+                      <a:picLocks noChangeArrowheads="1" noChangeAspect="1"/>
+                    </pic:cNvPicPr>
+                  </pic:nvPicPr>
+                  <pic:blipFill>
+                    <a:blip r:embed="rId14"/>
+                    <a:stretch>
+                      <a:fillRect/>
+                    </a:stretch>
+                  </pic:blipFill>
+                  <pic:spPr bwMode="auto">
+                    <a:xfrm>
+                      <a:off x="0" y="0"/>
+                      <a:ext cx="5334000" cy="4000499"/>
+                    </a:xfrm>
+                    <a:prstGeom prst="rect">
+                      <a:avLst/>
+                    </a:prstGeom>
+                    <a:noFill/>
+                    <a:ln w="9525">
+                      <a:noFill/>
+                      <a:headEnd/>
+                      <a:tailEnd/>
+                    </a:ln>
+                  </pic:spPr>
+                </pic:pic>
+              </a:graphicData>
+            </a:graphic>
+          </wp:inline>
+        </w:drawing>
+      </w:r>
+    </w:p>
+    <w:p>
+      <w:pPr>
+        <w:pStyle w:val="ImageCaption"/>
+      </w:pPr>
+      <w:r>
+        <w:t xml:space="preserve">Figure 1: Uniform scenarios Gaussian_copula, numerical simulation</w:t>
+      </w:r>
+    </w:p>
+    <w:p>
+      <w:pPr>
+        <w:pStyle w:val="CaptionedFigure"/>
+      </w:pPr>
+      <w:r>
+        <w:drawing>
+          <wp:inline>
+            <wp:extent cx="5334000" cy="4000499"/>
+            <wp:effectExtent b="0" l="0" r="0" t="0"/>
+            <wp:docPr descr="Figure 2: Contour plot Gaussian copula, numerical simulation" title="" id="18" name="Picture"/>
+            <a:graphic>
+              <a:graphicData uri="http://schemas.openxmlformats.org/drawingml/2006/picture">
+                <pic:pic>
+                  <pic:nvPicPr>
+                    <pic:cNvPr descr="figures\Contour_plot_Gaussian_copula,_numerical_simulation.png" id="19" name="Picture"/>
+                    <pic:cNvPicPr>
+                      <a:picLocks noChangeArrowheads="1" noChangeAspect="1"/>
+                    </pic:cNvPicPr>
+                  </pic:nvPicPr>
+                  <pic:blipFill>
+                    <a:blip r:embed="rId17"/>
+                    <a:stretch>
+                      <a:fillRect/>
+                    </a:stretch>
+                  </pic:blipFill>
+                  <pic:spPr bwMode="auto">
+                    <a:xfrm>
+                      <a:off x="0" y="0"/>
+                      <a:ext cx="5334000" cy="4000499"/>
+                    </a:xfrm>
+                    <a:prstGeom prst="rect">
+                      <a:avLst/>
+                    </a:prstGeom>
+                    <a:noFill/>
+                    <a:ln w="9525">
+                      <a:noFill/>
+                      <a:headEnd/>
+                      <a:tailEnd/>
+                    </a:ln>
+                  </pic:spPr>
+                </pic:pic>
+              </a:graphicData>
+            </a:graphic>
+          </wp:inline>
+        </w:drawing>
+      </w:r>
+    </w:p>
+    <w:p>
+      <w:pPr>
+        <w:pStyle w:val="ImageCaption"/>
+      </w:pPr>
+      <w:r>
+        <w:t xml:space="preserve">Figure 2: Contour plot Gaussian copula, numerical simulation</w:t>
+      </w:r>
+    </w:p>
+    <w:bookmarkEnd w:id="20"/>
+    <w:bookmarkStart w:id="27" w:name="cauchy-copula"/>
+    <w:p>
+      <w:pPr>
+        <w:pStyle w:val="Heading2"/>
+      </w:pPr>
+      <w:r>
+        <w:t xml:space="preserve">Cauchy copula</w:t>
+      </w:r>
+    </w:p>
+    <w:p>
+      <w:pPr>
+        <w:pStyle w:val="CaptionedFigure"/>
+      </w:pPr>
+      <w:r>
+        <w:drawing>
+          <wp:inline>
+            <wp:extent cx="5334000" cy="4000499"/>
+            <wp:effectExtent b="0" l="0" r="0" t="0"/>
+            <wp:docPr descr="Figure 3: Uniform scenarios Cauchy copula, numerical simulation" title="" id="22" name="Picture"/>
+            <a:graphic>
+              <a:graphicData uri="http://schemas.openxmlformats.org/drawingml/2006/picture">
+                <pic:pic>
+                  <pic:nvPicPr>
+                    <pic:cNvPr descr="figures\Uniform_scenarios_Cauchy_copula,_numerical_simulation.png" id="23" name="Picture"/>
+                    <pic:cNvPicPr>
+                      <a:picLocks noChangeArrowheads="1" noChangeAspect="1"/>
+                    </pic:cNvPicPr>
+                  </pic:nvPicPr>
+                  <pic:blipFill>
+                    <a:blip r:embed="rId21"/>
+                    <a:stretch>
+                      <a:fillRect/>
+                    </a:stretch>
+                  </pic:blipFill>
+                  <pic:spPr bwMode="auto">
+                    <a:xfrm>
+                      <a:off x="0" y="0"/>
+                      <a:ext cx="5334000" cy="4000499"/>
+                    </a:xfrm>
+                    <a:prstGeom prst="rect">
+                      <a:avLst/>
+                    </a:prstGeom>
+                    <a:noFill/>
+                    <a:ln w="9525">
+                      <a:noFill/>
+                      <a:headEnd/>
+                      <a:tailEnd/>
+                    </a:ln>
+                  </pic:spPr>
+                </pic:pic>
+              </a:graphicData>
+            </a:graphic>
+          </wp:inline>
+        </w:drawing>
+      </w:r>
+    </w:p>
+    <w:p>
+      <w:pPr>
+        <w:pStyle w:val="ImageCaption"/>
+      </w:pPr>
+      <w:r>
+        <w:t xml:space="preserve">Figure 3: Uniform scenarios Cauchy copula, numerical simulation</w:t>
+      </w:r>
+    </w:p>
+    <w:p>
+      <w:pPr>
+        <w:pStyle w:val="CaptionedFigure"/>
+      </w:pPr>
+      <w:r>
+        <w:drawing>
+          <wp:inline>
+            <wp:extent cx="5334000" cy="4000499"/>
+            <wp:effectExtent b="0" l="0" r="0" t="0"/>
+            <wp:docPr descr="Figure 4: Contour plot Cauchy copula, numerical simulation" title="" id="25" name="Picture"/>
+            <a:graphic>
+              <a:graphicData uri="http://schemas.openxmlformats.org/drawingml/2006/picture">
+                <pic:pic>
+                  <pic:nvPicPr>
+                    <pic:cNvPr descr="figures\Contour_plot_Cauchy_copula,_numerical_simulation.png" id="26" name="Picture"/>
+                    <pic:cNvPicPr>
+                      <a:picLocks noChangeArrowheads="1" noChangeAspect="1"/>
+                    </pic:cNvPicPr>
+                  </pic:nvPicPr>
+                  <pic:blipFill>
+                    <a:blip r:embed="rId24"/>
+                    <a:stretch>
+                      <a:fillRect/>
+                    </a:stretch>
+                  </pic:blipFill>
+                  <pic:spPr bwMode="auto">
+                    <a:xfrm>
+                      <a:off x="0" y="0"/>
+                      <a:ext cx="5334000" cy="4000499"/>
+                    </a:xfrm>
+                    <a:prstGeom prst="rect">
+                      <a:avLst/>
+                    </a:prstGeom>
+                    <a:noFill/>
+                    <a:ln w="9525">
+                      <a:noFill/>
+                      <a:headEnd/>
+                      <a:tailEnd/>
+                    </a:ln>
+                  </pic:spPr>
+                </pic:pic>
+              </a:graphicData>
+            </a:graphic>
+          </wp:inline>
+        </w:drawing>
+      </w:r>
+    </w:p>
+    <w:p>
+      <w:pPr>
+        <w:pStyle w:val="ImageCaption"/>
+      </w:pPr>
+      <w:r>
+        <w:t xml:space="preserve">Figure 4: Contour plot Cauchy copula, numerical simulation</w:t>
+      </w:r>
+    </w:p>
+    <w:bookmarkEnd w:id="27"/>
+    <w:bookmarkEnd w:id="28"/>
+    <w:bookmarkStart w:id="36" w:name="literature"/>
     <w:p>
       <w:pPr>
         <w:pStyle w:val="Heading1"/>
@@ -180,138 +1190,6 @@
       </w:pPr>
       <w:r>
         <w:t xml:space="preserve">D.Oh, A.Patton (2015). Modelling dependance in High dimensions with factor copulas.</w:t>
-      </w:r>
-      <w:r>
-        <w:t xml:space="preserve"> </w:t>
-      </w:r>
-      <w:hyperlink r:id="rId23">
-        <w:r>
-          <w:rPr>
-            <w:rStyle w:val="Hyperlink"/>
-          </w:rPr>
-          <w:t xml:space="preserve">(link)</w:t>
-        </w:r>
-      </w:hyperlink>
-    </w:p>
-    <w:p>
-      <w:pPr>
-        <w:pStyle w:val="Compact"/>
-        <w:numPr>
-          <w:ilvl w:val="0"/>
-          <w:numId w:val="1001"/>
-        </w:numPr>
-      </w:pPr>
-      <w:r>
-        <w:t xml:space="preserve">R.Cont et al. (2022). Tail-GAN: Nonparametric scenario generation for tail risk estimation.</w:t>
-      </w:r>
-      <w:r>
-        <w:t xml:space="preserve"> </w:t>
-      </w:r>
-      <w:hyperlink r:id="rId24">
-        <w:r>
-          <w:rPr>
-            <w:rStyle w:val="Hyperlink"/>
-          </w:rPr>
-          <w:t xml:space="preserve">(link)</w:t>
-        </w:r>
-      </w:hyperlink>
-    </w:p>
-    <w:p>
-      <w:pPr>
-        <w:pStyle w:val="Compact"/>
-        <w:numPr>
-          <w:ilvl w:val="0"/>
-          <w:numId w:val="1001"/>
-        </w:numPr>
-      </w:pPr>
-      <w:r>
-        <w:t xml:space="preserve">H.Buhler, B.Horvath (2021). A data-driven market simulator for small data environments.</w:t>
-      </w:r>
-      <w:r>
-        <w:t xml:space="preserve"> </w:t>
-      </w:r>
-      <w:hyperlink r:id="rId25">
-        <w:r>
-          <w:rPr>
-            <w:rStyle w:val="Hyperlink"/>
-          </w:rPr>
-          <w:t xml:space="preserve">(link)</w:t>
-        </w:r>
-      </w:hyperlink>
-    </w:p>
-    <w:p>
-      <w:pPr>
-        <w:pStyle w:val="Compact"/>
-        <w:numPr>
-          <w:ilvl w:val="0"/>
-          <w:numId w:val="1001"/>
-        </w:numPr>
-      </w:pPr>
-      <w:r>
-        <w:t xml:space="preserve">M.Vuletic, R.Cont (2025). VolGAN: a generative model for arbitrage-free implied volatility surfaces.</w:t>
-      </w:r>
-      <w:hyperlink r:id="rId26">
-        <w:r>
-          <w:rPr>
-            <w:rStyle w:val="Hyperlink"/>
-          </w:rPr>
-          <w:t xml:space="preserve">(link)</w:t>
-        </w:r>
-      </w:hyperlink>
-    </w:p>
-    <w:p>
-      <w:pPr>
-        <w:pStyle w:val="Compact"/>
-        <w:numPr>
-          <w:ilvl w:val="0"/>
-          <w:numId w:val="1001"/>
-        </w:numPr>
-      </w:pPr>
-      <w:r>
-        <w:t xml:space="preserve">B.Horvath et al. (2025). Generative Models in Finance: Market Generators, a Paradigm Shift in Financial Modeling.</w:t>
-      </w:r>
-      <w:hyperlink r:id="rId27">
-        <w:r>
-          <w:rPr>
-            <w:rStyle w:val="Hyperlink"/>
-          </w:rPr>
-          <w:t xml:space="preserve">(link)</w:t>
-        </w:r>
-      </w:hyperlink>
-    </w:p>
-    <w:p>
-      <w:pPr>
-        <w:pStyle w:val="Compact"/>
-        <w:numPr>
-          <w:ilvl w:val="0"/>
-          <w:numId w:val="1001"/>
-        </w:numPr>
-      </w:pPr>
-      <w:r>
-        <w:t xml:space="preserve">M.Vuletic, M.Cucuringu (2025). GraFiN-Gen: graph-based ensemble generative modelling for multi-asset forecasting.</w:t>
-      </w:r>
-      <w:r>
-        <w:t xml:space="preserve"> </w:t>
-      </w:r>
-      <w:hyperlink r:id="rId28">
-        <w:r>
-          <w:rPr>
-            <w:rStyle w:val="Hyperlink"/>
-          </w:rPr>
-          <w:t xml:space="preserve">(link)</w:t>
-        </w:r>
-      </w:hyperlink>
-    </w:p>
-    <w:p>
-      <w:pPr>
-        <w:pStyle w:val="Compact"/>
-        <w:numPr>
-          <w:ilvl w:val="0"/>
-          <w:numId w:val="1001"/>
-        </w:numPr>
-      </w:pPr>
-      <w:r>
-        <w:t xml:space="preserve">A.Sancetta, S.Satchell (2004). The Bernstein Copula and Its Applications to Modeling and Approximations of Multivariate Distributions.</w:t>
       </w:r>
       <w:r>
         <w:t xml:space="preserve"> </w:t>
@@ -325,8 +1203,140 @@
         </w:r>
       </w:hyperlink>
     </w:p>
-    <w:bookmarkEnd w:id="30"/>
-    <w:bookmarkStart w:id="31" w:name="appendix"/>
+    <w:p>
+      <w:pPr>
+        <w:pStyle w:val="Compact"/>
+        <w:numPr>
+          <w:ilvl w:val="0"/>
+          <w:numId w:val="1001"/>
+        </w:numPr>
+      </w:pPr>
+      <w:r>
+        <w:t xml:space="preserve">R.Cont et al. (2022). Tail-GAN: Nonparametric scenario generation for tail risk estimation.</w:t>
+      </w:r>
+      <w:r>
+        <w:t xml:space="preserve"> </w:t>
+      </w:r>
+      <w:hyperlink r:id="rId30">
+        <w:r>
+          <w:rPr>
+            <w:rStyle w:val="Hyperlink"/>
+          </w:rPr>
+          <w:t xml:space="preserve">(link)</w:t>
+        </w:r>
+      </w:hyperlink>
+    </w:p>
+    <w:p>
+      <w:pPr>
+        <w:pStyle w:val="Compact"/>
+        <w:numPr>
+          <w:ilvl w:val="0"/>
+          <w:numId w:val="1001"/>
+        </w:numPr>
+      </w:pPr>
+      <w:r>
+        <w:t xml:space="preserve">H.Buhler, B.Horvath (2021). A data-driven market simulator for small data environments.</w:t>
+      </w:r>
+      <w:r>
+        <w:t xml:space="preserve"> </w:t>
+      </w:r>
+      <w:hyperlink r:id="rId31">
+        <w:r>
+          <w:rPr>
+            <w:rStyle w:val="Hyperlink"/>
+          </w:rPr>
+          <w:t xml:space="preserve">(link)</w:t>
+        </w:r>
+      </w:hyperlink>
+    </w:p>
+    <w:p>
+      <w:pPr>
+        <w:pStyle w:val="Compact"/>
+        <w:numPr>
+          <w:ilvl w:val="0"/>
+          <w:numId w:val="1001"/>
+        </w:numPr>
+      </w:pPr>
+      <w:r>
+        <w:t xml:space="preserve">M.Vuletic, R.Cont (2025). VolGAN: a generative model for arbitrage-free implied volatility surfaces.</w:t>
+      </w:r>
+      <w:hyperlink r:id="rId32">
+        <w:r>
+          <w:rPr>
+            <w:rStyle w:val="Hyperlink"/>
+          </w:rPr>
+          <w:t xml:space="preserve">(link)</w:t>
+        </w:r>
+      </w:hyperlink>
+    </w:p>
+    <w:p>
+      <w:pPr>
+        <w:pStyle w:val="Compact"/>
+        <w:numPr>
+          <w:ilvl w:val="0"/>
+          <w:numId w:val="1001"/>
+        </w:numPr>
+      </w:pPr>
+      <w:r>
+        <w:t xml:space="preserve">B.Horvath et al. (2025). Generative Models in Finance: Market Generators, a Paradigm Shift in Financial Modeling.</w:t>
+      </w:r>
+      <w:hyperlink r:id="rId33">
+        <w:r>
+          <w:rPr>
+            <w:rStyle w:val="Hyperlink"/>
+          </w:rPr>
+          <w:t xml:space="preserve">(link)</w:t>
+        </w:r>
+      </w:hyperlink>
+    </w:p>
+    <w:p>
+      <w:pPr>
+        <w:pStyle w:val="Compact"/>
+        <w:numPr>
+          <w:ilvl w:val="0"/>
+          <w:numId w:val="1001"/>
+        </w:numPr>
+      </w:pPr>
+      <w:r>
+        <w:t xml:space="preserve">M.Vuletic, M.Cucuringu (2025). GraFiN-Gen: graph-based ensemble generative modelling for multi-asset forecasting.</w:t>
+      </w:r>
+      <w:r>
+        <w:t xml:space="preserve"> </w:t>
+      </w:r>
+      <w:hyperlink r:id="rId34">
+        <w:r>
+          <w:rPr>
+            <w:rStyle w:val="Hyperlink"/>
+          </w:rPr>
+          <w:t xml:space="preserve">(link)</w:t>
+        </w:r>
+      </w:hyperlink>
+    </w:p>
+    <w:p>
+      <w:pPr>
+        <w:pStyle w:val="Compact"/>
+        <w:numPr>
+          <w:ilvl w:val="0"/>
+          <w:numId w:val="1001"/>
+        </w:numPr>
+      </w:pPr>
+      <w:r>
+        <w:t xml:space="preserve">A.Sancetta, S.Satchell (2004). The Bernstein Copula and Its Applications to Modeling and Approximations of Multivariate Distributions.</w:t>
+      </w:r>
+      <w:r>
+        <w:t xml:space="preserve"> </w:t>
+      </w:r>
+      <w:hyperlink r:id="rId35">
+        <w:r>
+          <w:rPr>
+            <w:rStyle w:val="Hyperlink"/>
+          </w:rPr>
+          <w:t xml:space="preserve">(link)</w:t>
+        </w:r>
+      </w:hyperlink>
+    </w:p>
+    <w:bookmarkEnd w:id="36"/>
+    <w:bookmarkStart w:id="37" w:name="appendix"/>
     <w:p>
       <w:pPr>
         <w:pStyle w:val="Heading1"/>
@@ -354,7 +1364,7 @@
         </w:r>
       </w:hyperlink>
     </w:p>
-    <w:bookmarkEnd w:id="31"/>
+    <w:bookmarkEnd w:id="37"/>
     <w:sectPr>
       <w:footnotePr>
         <w:numRestart w:val="eachSect"/>
@@ -591,10 +1601,10 @@
   <w:docDefaults>
     <w:rPrDefault>
       <w:rPr>
-        <w:rFonts w:asciiTheme="minorHAnsi" w:cstheme="minorBidi" w:eastAsiaTheme="minorHAnsi" w:hAnsiTheme="minorHAnsi"/>
+        <w:rFonts w:asciiTheme="minorHAnsi" w:cstheme="minorBidi" w:eastAsiaTheme="minorEastAsia" w:hAnsiTheme="minorHAnsi"/>
         <w:sz w:val="24"/>
         <w:szCs w:val="24"/>
-        <w:lang w:bidi="ar-SA" w:eastAsia="en-US" w:val="en-US"/>
+        <w:lang w:bidi="ar-SA" w:eastAsia="zh-CN" w:val="en-US"/>
       </w:rPr>
     </w:rPrDefault>
     <w:pPrDefault>
@@ -646,8 +1656,6 @@
     </w:pPr>
     <w:rPr>
       <w:rFonts w:asciiTheme="majorHAnsi" w:cstheme="majorBidi" w:eastAsiaTheme="majorEastAsia" w:hAnsiTheme="majorHAnsi"/>
-      <w:spacing w:val="-10"/>
-      <w:kern w:val="28"/>
       <w:sz w:val="56"/>
       <w:szCs w:val="56"/>
     </w:rPr>
@@ -660,8 +1668,6 @@
     <w:rsid w:val="00A10FD9"/>
     <w:rPr>
       <w:rFonts w:asciiTheme="majorHAnsi" w:cstheme="majorBidi" w:eastAsiaTheme="majorEastAsia" w:hAnsiTheme="majorHAnsi"/>
-      <w:spacing w:val="-10"/>
-      <w:kern w:val="28"/>
       <w:sz w:val="56"/>
       <w:szCs w:val="56"/>
     </w:rPr>
@@ -702,23 +1708,31 @@
   </w:style>
   <w:style w:customStyle="1" w:styleId="Author" w:type="paragraph">
     <w:name w:val="Author"/>
+    <w:basedOn w:val="Title"/>
     <w:next w:val="BodyText"/>
     <w:qFormat/>
     <w:pPr>
       <w:keepNext/>
       <w:keepLines/>
-      <w:jc w:val="center"/>
     </w:pPr>
+    <w:rPr>
+      <w:sz w:val="24"/>
+      <w:szCs w:val="24"/>
+    </w:rPr>
   </w:style>
   <w:style w:styleId="Date" w:type="paragraph">
     <w:name w:val="Date"/>
+    <w:basedOn w:val="Title"/>
     <w:next w:val="BodyText"/>
     <w:qFormat/>
     <w:pPr>
       <w:keepNext/>
       <w:keepLines/>
-      <w:jc w:val="center"/>
     </w:pPr>
+    <w:rPr>
+      <w:sz w:val="24"/>
+      <w:szCs w:val="24"/>
+    </w:rPr>
   </w:style>
   <w:style w:customStyle="1" w:styleId="AbstractTitle" w:type="paragraph">
     <w:name w:val="Abstract Title"/>
@@ -1131,13 +2145,6 @@
       </w:tblCellMar>
     </w:tblPr>
     <w:tblStylePr w:type="firstRow">
-      <w:tblPr>
-        <w:jc w:val="left"/>
-        <w:tblInd w:type="dxa" w:w="0"/>
-      </w:tblPr>
-      <w:trPr>
-        <w:jc w:val="left"/>
-      </w:trPr>
       <w:tcPr>
         <w:tcBorders>
           <w:bottom w:val="single"/>

</xml_diff>

<commit_message>
Adding proper VaR implementation
</commit_message>
<xml_diff>
--- a/document/manuscript.docx
+++ b/document/manuscript.docx
@@ -953,7 +953,7 @@
               <a:graphicData uri="http://schemas.openxmlformats.org/drawingml/2006/picture">
                 <pic:pic>
                   <pic:nvPicPr>
-                    <pic:cNvPr descr="figures\Uniform_scenarios_Gaussian_copula,_numerical_simulation.png" id="16" name="Picture"/>
+                    <pic:cNvPr descr="figures\Uniform_scenarios_Gaussian_copula_(numerical_simulation).png" id="16" name="Picture"/>
                     <pic:cNvPicPr>
                       <a:picLocks noChangeArrowheads="1" noChangeAspect="1"/>
                     </pic:cNvPicPr>
@@ -1008,7 +1008,7 @@
               <a:graphicData uri="http://schemas.openxmlformats.org/drawingml/2006/picture">
                 <pic:pic>
                   <pic:nvPicPr>
-                    <pic:cNvPr descr="figures\Contour_plot_Gaussian_copula,_numerical_simulation.png" id="19" name="Picture"/>
+                    <pic:cNvPr descr="figures\Contour_plot_Gaussian_copula_(numerical_simulation).png" id="19" name="Picture"/>
                     <pic:cNvPicPr>
                       <a:picLocks noChangeArrowheads="1" noChangeAspect="1"/>
                     </pic:cNvPicPr>
@@ -1073,7 +1073,7 @@
               <a:graphicData uri="http://schemas.openxmlformats.org/drawingml/2006/picture">
                 <pic:pic>
                   <pic:nvPicPr>
-                    <pic:cNvPr descr="figures\Uniform_scenarios_Cauchy_copula,_numerical_simulation.png" id="23" name="Picture"/>
+                    <pic:cNvPr descr="figures\Uniform_scenarios_Cauchy_copula_(numerical_simulation).png" id="23" name="Picture"/>
                     <pic:cNvPicPr>
                       <a:picLocks noChangeArrowheads="1" noChangeAspect="1"/>
                     </pic:cNvPicPr>
@@ -1128,7 +1128,7 @@
               <a:graphicData uri="http://schemas.openxmlformats.org/drawingml/2006/picture">
                 <pic:pic>
                   <pic:nvPicPr>
-                    <pic:cNvPr descr="figures\Contour_plot_Cauchy_copula,_numerical_simulation.png" id="26" name="Picture"/>
+                    <pic:cNvPr descr="figures\Contour_plot_Cauchy_copula_(numerical_simulation).png" id="26" name="Picture"/>
                     <pic:cNvPicPr>
                       <a:picLocks noChangeArrowheads="1" noChangeAspect="1"/>
                     </pic:cNvPicPr>

</xml_diff>